<commit_message>
Resume: date the latest title from its position; docx renders promotion history
</commit_message>
<xml_diff>
--- a/resume/resume.docx
+++ b/resume/resume.docx
@@ -33,7 +33,7 @@
     </w:p>
     <w:p>
       <w:r>
-        <w:t xml:space="preserve">I build multi-tenant SaaS platforms end to end - the Terraform that provisions them, the API they run on, and the product customers actually use. Staff Software Engineer - 8+ years in software, 5+ hands-on with AWS, and ~3 years leading cloud platforms end to end: from AWS infrastructure-as-code to the shared backend services an entire product fleet runs on. Near-sole author of a Terraform control-plane and internal developer platform that ships 7 multi-tenant client portals on ECS Fargate, and primary author (78%) of the core REST API those portals are built on. Operates ~$110K/year of multi-tenant portal infrastructure on AWS, turns it into self-service, and builds the products on it end to end - full-stack from React/TypeScript through Node/GraphQL - not just the infrastructure they run on.</w:t>
+        <w:t xml:space="preserve">I build multi-tenant SaaS platforms end to end - the Terraform that provisions them, the API they run on, and the product customers actually use. Staff Software Engineer - 8+ years in software, 5+ hands-on with AWS, and ~3 years leading cloud platforms: from AWS infrastructure-as-code to the shared backend services an entire product fleet runs on. Near-sole author of a Terraform control-plane and internal developer platform that ships 7 multi-tenant client portals on ECS Fargate, and primary author (78%) of the core REST API those portals are built on. Operates ~$110K/year of multi-tenant portal infrastructure on AWS, turns it into self-service, and builds the products on it - full-stack from React/TypeScript through Node/GraphQL - not just the infrastructure they run on.</w:t>
       </w:r>
     </w:p>
     <w:p>
@@ -60,7 +60,12 @@
         <w:t xml:space="preserve">ESC Partners / HometownHUB</w:t>
       </w:r>
       <w:r>
-        <w:t xml:space="preserve"> - New York, USA (Remote) | May 2023 - Present</w:t>
+        <w:t xml:space="preserve"> - New York, USA (Remote) | Sep 2025 - Present</w:t>
+      </w:r>
+    </w:p>
+    <w:p>
+      <w:r>
+        <w:t xml:space="preserve">Previously Senior Full-Stack Engineer (Cloud) | May 2023 - Jan 2026</w:t>
       </w:r>
     </w:p>
     <w:p>
@@ -318,7 +323,7 @@
         <w:pStyle w:val="Heading3"/>
       </w:pPr>
       <w:r>
-        <w:t xml:space="preserve">Full Stack Software Engineer - Ordermentum (New South Wales, Australia / Remote)</w:t>
+        <w:t xml:space="preserve">Full Stack Software Engineer - Ordermentum (New South Wales, Australia / Remote, contract)</w:t>
       </w:r>
     </w:p>
     <w:p>

</xml_diff>

<commit_message>
Content: reconcile with the LinkedIn data export
</commit_message>
<xml_diff>
--- a/resume/resume.docx
+++ b/resume/resume.docx
@@ -328,7 +328,7 @@
     </w:p>
     <w:p>
       <w:r>
-        <w:t xml:space="preserve">Sep 2022 - Feb 2023</w:t>
+        <w:t xml:space="preserve">Sep 2022 - Mar 2023</w:t>
       </w:r>
     </w:p>
     <w:p>
@@ -378,7 +378,7 @@
     </w:p>
     <w:p>
       <w:r>
-        <w:t xml:space="preserve">Feb 2020 - Mar 2022</w:t>
+        <w:t xml:space="preserve">Feb 2020 - Apr 2022</w:t>
       </w:r>
     </w:p>
     <w:p>
@@ -398,12 +398,12 @@
         <w:pStyle w:val="Heading3"/>
       </w:pPr>
       <w:r>
-        <w:t xml:space="preserve">Software Developer - Zencomputes (Singapore)</w:t>
-      </w:r>
-    </w:p>
-    <w:p>
-      <w:r>
-        <w:t xml:space="preserve">2019 - 2020</w:t>
+        <w:t xml:space="preserve">Full Stack Developer - Zencomputes (Singapore)</w:t>
+      </w:r>
+    </w:p>
+    <w:p>
+      <w:r>
+        <w:t xml:space="preserve">Mar 2019 - Feb 2020</w:t>
       </w:r>
     </w:p>
     <w:p>
@@ -423,12 +423,12 @@
         <w:pStyle w:val="Heading3"/>
       </w:pPr>
       <w:r>
-        <w:t xml:space="preserve">Mobile App Developer - Halcyon Digital (Philippines)</w:t>
-      </w:r>
-    </w:p>
-    <w:p>
-      <w:r>
-        <w:t xml:space="preserve">2018 - 2019</w:t>
+        <w:t xml:space="preserve">Mobile Application Developer - Halcyon Digital Media Design (Philippines)</w:t>
+      </w:r>
+    </w:p>
+    <w:p>
+      <w:r>
+        <w:t xml:space="preserve">Mar 2018 - Mar 2019</w:t>
       </w:r>
     </w:p>
     <w:p>

</xml_diff>

<commit_message>
Content: hero availability line, markets, stack de-duplication, ai-sdlc wording
</commit_message>
<xml_diff>
--- a/resume/resume.docx
+++ b/resume/resume.docx
@@ -459,7 +459,7 @@
         <w:t xml:space="preserve">Cloud &amp; Infra: </w:t>
       </w:r>
       <w:r>
-        <w:t xml:space="preserve">AWS - ECS Fargate, CloudFront, Cognito, RDS, ElastiCache, KMS, Secrets Manager, WAFv2, SES, S3, Route 53, VPC, ALB, Elastic Beanstalk, Bedrock, Terraform, Docker, Kubernetes, Linux, OpenSearch</w:t>
+        <w:t xml:space="preserve">AWS - ECS Fargate, CloudFront, Cognito, RDS, ElastiCache, KMS, Secrets Manager, WAFv2, SES, S3, Route 53, VPC, ALB, Elastic Beanstalk, Terraform, Docker, Kubernetes, Linux, OpenSearch</w:t>
       </w:r>
     </w:p>
     <w:p>
@@ -503,7 +503,7 @@
         <w:t xml:space="preserve">Observability &amp; Security: </w:t>
       </w:r>
       <w:r>
-        <w:t xml:space="preserve">Datadog RUM/APM, CloudWatch, Sentry, Structured logging, OWASP/IDOR, JWT, WAF, Snyk</w:t>
+        <w:t xml:space="preserve">Datadog RUM/APM, CloudWatch, Sentry, Structured logging, OWASP/IDOR, JWT, WAFv2, Snyk</w:t>
       </w:r>
     </w:p>
     <w:p>

</xml_diff>

<commit_message>
Resume: trade the campaign manager bullet for the supply-chain gate
</commit_message>
<xml_diff>
--- a/resume/resume.docx
+++ b/resume/resume.docx
@@ -134,10 +134,10 @@
         <w:rPr>
           <w:b/>
         </w:rPr>
-        <w:t xml:space="preserve">Designed and built a multi-channel campaign manager </w:t>
-      </w:r>
-      <w:r>
-        <w:t xml:space="preserve">integrating Twilio (SMS + IVR voice) and AWS SES (email) with CSV recipient lists and templated messaging, replacing manual notification workflows.</w:t>
+        <w:t xml:space="preserve">Made the supply-chain gate real across 14 repositories </w:t>
+      </w:r>
+      <w:r>
+        <w:t xml:space="preserve">- a blocking Snyk scan ahead of build and deploy on every pipeline - then rolled keyless OIDC deploys through pilot, all test environments, and production on 4 of them, taking long-lived AWS credentials out of CI.</w:t>
       </w:r>
     </w:p>
     <w:p>

</xml_diff>

<commit_message>
Profile: truth pass - four claims brought in line with their evidence, light accent to AA, mono font off the critical path
</commit_message>
<xml_diff>
--- a/resume/resume.docx
+++ b/resume/resume.docx
@@ -134,10 +134,10 @@
         <w:rPr>
           <w:b/>
         </w:rPr>
-        <w:t xml:space="preserve">Made the supply-chain gate real across 14 repositories </w:t>
-      </w:r>
-      <w:r>
-        <w:t xml:space="preserve">- a blocking Snyk scan ahead of build and deploy on every pipeline - then rolled keyless OIDC deploys through pilot, all test environments, and production on 4 of them, taking long-lived AWS credentials out of CI.</w:t>
+        <w:t xml:space="preserve">Rolled blocking Snyk gates across the portal pipelines </w:t>
+      </w:r>
+      <w:r>
+        <w:t xml:space="preserve">- scan first, ahead of build and deploy - then keyless OIDC deploys through pilot, all test environments, and production on 4 repositories, taking long-lived AWS credentials out of CI.</w:t>
       </w:r>
     </w:p>
     <w:p>

</xml_diff>

<commit_message>
Profile: tell the flagship stories as they stand - two API generations, a control-plane the fleet is migrating onto, AI tooling kept, shelved and designed
</commit_message>
<xml_diff>
--- a/resume/resume.docx
+++ b/resume/resume.docx
@@ -33,7 +33,7 @@
     </w:p>
     <w:p>
       <w:r>
-        <w:t xml:space="preserve">I build multi-tenant SaaS platforms end to end - the Terraform that provisions them, the API they run on, and the product customers actually use. Staff Software Engineer - 8+ years in software, 5+ hands-on with AWS, and ~3 years leading cloud platforms: from AWS infrastructure-as-code to the shared backend services an entire product fleet runs on. Near-sole author of a Terraform control-plane and internal developer platform that ships 7 multi-tenant client portals on ECS Fargate, and primary author (78%) of the core REST API those portals are built on. Operates ~$110K/year of multi-tenant portal infrastructure on AWS, turns it into self-service, and builds the products on it - full-stack from React/TypeScript through Node/GraphQL - not just the infrastructure they run on.</w:t>
+        <w:t xml:space="preserve">I build multi-tenant SaaS platforms end to end - the Terraform that provisions them, the API they run on, and the product customers actually use. Staff Software Engineer - 8+ years in software, 5+ hands-on with AWS, and ~3 years leading cloud platforms: from AWS infrastructure-as-code to the shared backend services an entire product fleet runs on. Primary author of the Terraform control-plane the fleet's provisioning is consolidating onto, and of both generations of the core REST API the 7 multi-tenant client portals run on - 58% of v1, 78% of v2. Operates ~$110K/year of multi-tenant portal infrastructure on AWS, turns it into self-service, and builds the products on it - full-stack from React/TypeScript through Node/GraphQL - not just the infrastructure they run on.</w:t>
       </w:r>
     </w:p>
     <w:p>
@@ -80,28 +80,28 @@
         <w:rPr>
           <w:b/>
         </w:rPr>
-        <w:t xml:space="preserve">Primary author (78%) of the core REST API middleware </w:t>
-      </w:r>
-      <w:r>
-        <w:t xml:space="preserve">connecting 7 utility tenant portals to Oracle CCS via OAuth 2.0 - the multi-tenant auth, data-access, and integration patterns the whole fleet is built on.</w:t>
-      </w:r>
-    </w:p>
-    <w:p>
-      <w:pPr>
-        <w:pStyle w:val="ListParagraph"/>
-        <w:numPr>
-          <w:ilvl w:val="0"/>
-          <w:numId w:val="1"/>
-        </w:numPr>
-      </w:pPr>
-      <w:r>
-        <w:rPr>
-          <w:b/>
-        </w:rPr>
-        <w:t xml:space="preserve">Sole author of the internal developer platform: </w:t>
-      </w:r>
-      <w:r>
-        <w:t xml:space="preserve">a Terraform control-plane (9 stacks, ~60 AWS resource types) with a Fastify/React dashboard that self-service provisions and ships every client environment - Cognito, ECS Fargate, CloudFront, WAFv2, Secrets Manager, Route 53, ElastiCache, KMS - turning tenant onboarding into a templated, repeatable workflow.</w:t>
+        <w:t xml:space="preserve">Primary author of both generations of the fleet's core REST API </w:t>
+      </w:r>
+      <w:r>
+        <w:t xml:space="preserve">- 58% of v1, which still serves most of the fleet, and 78% of v2, which serves the first two tenants - owning the multi-tenant auth, data-access and Oracle CCS (OAuth 2.0) integration patterns both generations share.</w:t>
+      </w:r>
+    </w:p>
+    <w:p>
+      <w:pPr>
+        <w:pStyle w:val="ListParagraph"/>
+        <w:numPr>
+          <w:ilvl w:val="0"/>
+          <w:numId w:val="1"/>
+        </w:numPr>
+      </w:pPr>
+      <w:r>
+        <w:rPr>
+          <w:b/>
+        </w:rPr>
+        <w:t xml:space="preserve">Primary author (93%) of the internal developer platform: </w:t>
+      </w:r>
+      <w:r>
+        <w:t xml:space="preserve">a Terraform control-plane (9 stacks, ~60 AWS resource types - Cognito, ECS Fargate, CloudFront, WAFv2, Secrets Manager, Route 53, ElastiCache, KMS) with a Fastify/React dashboard that plans, applies and cost-attributes; the fleet's per-portal provisioning is consolidating onto it tenant by tenant.</w:t>
       </w:r>
     </w:p>
     <w:p>
@@ -137,7 +137,7 @@
         <w:t xml:space="preserve">Rolled blocking Snyk gates across the portal pipelines </w:t>
       </w:r>
       <w:r>
-        <w:t xml:space="preserve">- scan first, ahead of build and deploy - then keyless OIDC deploys through pilot, all test environments, and production on 4 repositories, taking long-lived AWS credentials out of CI.</w:t>
+        <w:t xml:space="preserve">- scan first, ahead of build and deploy - then keyless OIDC deploys through pilot, all test environments, and production on 4 repositories, taking long-lived AWS credentials out of the deploy path.</w:t>
       </w:r>
     </w:p>
     <w:p>
@@ -170,10 +170,10 @@
         <w:rPr>
           <w:b/>
         </w:rPr>
-        <w:t xml:space="preserve">Built the team's AI-augmented developer tooling </w:t>
-      </w:r>
-      <w:r>
-        <w:t xml:space="preserve">- an AWS Bedrock auto-remediation service (Claude via bedrock-runtime) that triages alerts and opens fix PRs, an automated Claude PR-reviewer in CI, an agentic AI-SDLC pipeline (Jira + GitHub, with human approval gates), and an LLM-maintained knowledge base built with Python data pipelines.</w:t>
+        <w:t xml:space="preserve">Built, measured and pruned the team's AI tooling </w:t>
+      </w:r>
+      <w:r>
+        <w:t xml:space="preserve">- kept a Claude PR reviewer in CI on the core API and backend, shelved a Bedrock auto-remediation service that was never wired to a live alarm, shipped a Bedrock knowledge-base agent (curated-first retrieval, flagged SQL fallback), and designed a ticket-to-PR pipeline with human gates, not yet live.</w:t>
       </w:r>
     </w:p>
     <w:p>

</xml_diff>

<commit_message>
Resume: contracts labelled, Senior title ends Aug 2025, BaseMap nested under the CoDev agency, earlier roles one line each, two 2026 bullets, 60-word summary
</commit_message>
<xml_diff>
--- a/resume/resume.docx
+++ b/resume/resume.docx
@@ -33,7 +33,7 @@
     </w:p>
     <w:p>
       <w:r>
-        <w:t xml:space="preserve">I build multi-tenant SaaS platforms end to end - the Terraform that provisions them, the API they run on, and the product customers actually use. Staff Software Engineer - 8+ years in software, 5+ hands-on with AWS, and ~3 years leading cloud platforms: from AWS infrastructure-as-code to the shared backend services an entire product fleet runs on. Primary author of the Terraform control-plane the fleet's provisioning is consolidating onto, and of both generations of the core REST API the 7 multi-tenant client portals run on - 58% of v1, 78% of v2. Operates ~$110K/year of multi-tenant portal infrastructure on AWS, turns it into self-service, and builds the products on it - full-stack from React/TypeScript through Node/GraphQL - not just the infrastructure they run on.</w:t>
+        <w:t xml:space="preserve">Staff Software Engineer - I build the platform other engineers ship on. 8+ years in software, 5+ on AWS, ~3 leading a multi-tenant SaaS platform: primary author (93%) of the Terraform control-plane the fleet is migrating onto, primary author of both generations of the core REST API behind 7 utility client portals (58% of v1, 78% of v2), and its operator - CI/CD, observability, on-call, cost.</w:t>
       </w:r>
     </w:p>
     <w:p>
@@ -65,7 +65,7 @@
     </w:p>
     <w:p>
       <w:r>
-        <w:t xml:space="preserve">Previously Senior Full-Stack Engineer (Cloud) | May 2023 - Jan 2026</w:t>
+        <w:t xml:space="preserve">Previously Senior Full-Stack Engineer (Cloud) | May 2023 - Aug 2025</w:t>
       </w:r>
     </w:p>
     <w:p>
@@ -206,6 +206,42 @@
         <w:rPr>
           <w:b/>
         </w:rPr>
+        <w:t xml:space="preserve">Shipped the fix for an SSN identity-verification gap enabling account takeover </w:t>
+      </w:r>
+      <w:r>
+        <w:t xml:space="preserve">- the last-four plus street match resolved to the wrong person on ~2.4% of one tenant's accounts - as attempt lockout plus ZIP-based disambiguation against the brute-forceable last-4 space, flag-gated for per-tenant rollout.</w:t>
+      </w:r>
+    </w:p>
+    <w:p>
+      <w:pPr>
+        <w:pStyle w:val="ListParagraph"/>
+        <w:numPr>
+          <w:ilvl w:val="0"/>
+          <w:numId w:val="1"/>
+        </w:numPr>
+      </w:pPr>
+      <w:r>
+        <w:rPr>
+          <w:b/>
+        </w:rPr>
+        <w:t xml:space="preserve">Built the fleet-wide interaction audit trail </w:t>
+      </w:r>
+      <w:r>
+        <w:t xml:space="preserve">- a capture hook for authenticated actions and page views, a tenant-scoped, IDOR-safe admin history API with CSV export and rate limiting - then extended it to admin reads and impersonated sessions attributed to the acting admin; one composite index took its sessions view from 102 seconds to 2.4.</w:t>
+      </w:r>
+    </w:p>
+    <w:p>
+      <w:pPr>
+        <w:pStyle w:val="ListParagraph"/>
+        <w:numPr>
+          <w:ilvl w:val="0"/>
+          <w:numId w:val="1"/>
+        </w:numPr>
+      </w:pPr>
+      <w:r>
+        <w:rPr>
+          <w:b/>
+        </w:rPr>
         <w:t xml:space="preserve">Owned production go-live readiness for 6 client launches </w:t>
       </w:r>
       <w:r>
@@ -298,7 +334,7 @@
         <w:pStyle w:val="Heading3"/>
       </w:pPr>
       <w:r>
-        <w:t xml:space="preserve">Senior Software Engineer - CoDev (Utah, USA / Remote)</w:t>
+        <w:t xml:space="preserve">Senior Software Engineer - CoDev - agency; embedded with client BaseMap (Utah, USA / Remote)</w:t>
       </w:r>
     </w:p>
     <w:p>
@@ -323,7 +359,7 @@
         <w:pStyle w:val="Heading3"/>
       </w:pPr>
       <w:r>
-        <w:t xml:space="preserve">Full Stack Software Engineer - Ordermentum (New South Wales, Australia / Remote, contract)</w:t>
+        <w:t xml:space="preserve">Full Stack Software Engineer - Ordermentum (NSW, Australia / Remote, contract)</w:t>
       </w:r>
     </w:p>
     <w:p>
@@ -341,31 +377,6 @@
       </w:pPr>
       <w:r>
         <w:t xml:space="preserve">Designed and deployed a restaurant ordering and payment management system for hospitality clients (Node.js, PostgreSQL, Docker, Kubernetes).</w:t>
-      </w:r>
-    </w:p>
-    <w:p>
-      <w:pPr>
-        <w:pStyle w:val="Heading3"/>
-      </w:pPr>
-      <w:r>
-        <w:t xml:space="preserve">Senior Software Engineer - BaseMap Inc (Washington, USA / Remote)</w:t>
-      </w:r>
-    </w:p>
-    <w:p>
-      <w:r>
-        <w:t xml:space="preserve">Mar 2022 - Sep 2022</w:t>
-      </w:r>
-    </w:p>
-    <w:p>
-      <w:pPr>
-        <w:pStyle w:val="ListParagraph"/>
-        <w:numPr>
-          <w:ilvl w:val="0"/>
-          <w:numId w:val="1"/>
-        </w:numPr>
-      </w:pPr>
-      <w:r>
-        <w:t xml:space="preserve">Built GIS-based hunting and fishing mapping features (JavaScript, Docker) on a consumer GPS-maps platform.</w:t>
       </w:r>
     </w:p>
     <w:p>

</xml_diff>